<commit_message>
docs: verify lab requirements and prepare four reports with supplied cover
</commit_message>
<xml_diff>
--- a/docs/Lab2_Delivery_Report.docx
+++ b/docs/Lab2_Delivery_Report.docx
@@ -4,159 +4,924 @@
   <w:body>
     <w:p>
       <w:pPr>
-        <w:spacing w:before="0" w:after="0"/>
-        <w:ind w:firstLine="0"/>
+        <w:spacing w:after="0" w:before="0" w:line="360" w:lineRule="auto"/>
+        <w:ind w:right="0" w:firstLine="0" w:left="0"/>
         <w:jc w:val="center"/>
+        <w:rPr/>
       </w:pPr>
       <w:r>
         <w:rPr>
           <w:rFonts w:ascii="Times New Roman" w:hAnsi="Times New Roman" w:eastAsia="Times New Roman" w:cs="Times New Roman"/>
           <w:b w:val="0"/>
+          <w:color w:val="000000"/>
           <w:sz w:val="28"/>
+        </w:rPr>
+        <w:t xml:space="preserve">МИНИСТЕРСТВО НАУКИ И ВЫСШЕГО ОБРАЗОВАНИЯ</w:t>
+      </w:r>
+      <w:r>
+        <w:rPr>
+          <w:rFonts w:ascii="Times New Roman" w:hAnsi="Times New Roman" w:eastAsia="Times New Roman" w:cs="Times New Roman"/>
+          <w:b w:val="0"/>
           <w:color w:val="000000"/>
+          <w:sz w:val="28"/>
         </w:rPr>
-        <w:t>Наименование учебного заведения</w:t>
-        <w:br/>
-        <w:t>________________________________________</w:t>
+      </w:r>
+      <w:r>
+        <w:rPr>
+          <w:rFonts w:ascii="Times New Roman" w:hAnsi="Times New Roman" w:eastAsia="Times New Roman" w:cs="Times New Roman"/>
+          <w:color w:val="000000"/>
+          <w:sz w:val="28"/>
+        </w:rPr>
       </w:r>
     </w:p>
     <w:p>
       <w:pPr>
-        <w:spacing w:before="0" w:after="1040"/>
-        <w:ind w:firstLine="0"/>
+        <w:spacing w:after="0" w:before="0" w:line="360" w:lineRule="auto"/>
+        <w:ind w:right="0" w:firstLine="0" w:left="0"/>
         <w:jc w:val="center"/>
+        <w:rPr/>
       </w:pPr>
       <w:r>
         <w:rPr>
           <w:rFonts w:ascii="Times New Roman" w:hAnsi="Times New Roman" w:eastAsia="Times New Roman" w:cs="Times New Roman"/>
           <w:b w:val="0"/>
+          <w:color w:val="000000"/>
           <w:sz w:val="28"/>
+        </w:rPr>
+        <w:t xml:space="preserve">РОССИЙСКОЙ ФЕДЕРАЦИИ</w:t>
+      </w:r>
+      <w:r>
+        <w:rPr>
+          <w:rFonts w:ascii="Times New Roman" w:hAnsi="Times New Roman" w:eastAsia="Times New Roman" w:cs="Times New Roman"/>
+          <w:b w:val="0"/>
           <w:color w:val="000000"/>
+          <w:sz w:val="28"/>
         </w:rPr>
-        <w:t>Кафедра или отделение</w:t>
-        <w:br/>
-        <w:t>________________________________________</w:t>
+      </w:r>
+      <w:r>
+        <w:rPr>
+          <w:rFonts w:ascii="Times New Roman" w:hAnsi="Times New Roman" w:eastAsia="Times New Roman" w:cs="Times New Roman"/>
+          <w:color w:val="000000"/>
+          <w:sz w:val="28"/>
+        </w:rPr>
       </w:r>
     </w:p>
     <w:p>
       <w:pPr>
-        <w:pStyle w:val="Title"/>
-        <w:spacing w:before="0" w:after="0"/>
-        <w:ind w:firstLine="0"/>
+        <w:spacing w:after="0" w:before="0" w:line="360" w:lineRule="auto"/>
+        <w:ind w:right="0" w:firstLine="0" w:left="0"/>
         <w:jc w:val="center"/>
-      </w:pPr>
-      <w:r>
-        <w:rPr>
-          <w:rFonts w:ascii="Times New Roman" w:hAnsi="Times New Roman" w:eastAsia="Times New Roman" w:cs="Times New Roman"/>
-          <w:b/>
-          <w:sz w:val="28"/>
-          <w:color w:val="000000"/>
-        </w:rPr>
-        <w:t>ОТЧЕТ</w:t>
-      </w:r>
-    </w:p>
-    <w:p>
-      <w:pPr>
-        <w:spacing w:before="0" w:after="0"/>
-        <w:ind w:firstLine="0"/>
-        <w:jc w:val="center"/>
+        <w:rPr/>
       </w:pPr>
       <w:r>
         <w:rPr>
           <w:rFonts w:ascii="Times New Roman" w:hAnsi="Times New Roman" w:eastAsia="Times New Roman" w:cs="Times New Roman"/>
           <w:b w:val="0"/>
+          <w:color w:val="000000"/>
           <w:sz w:val="28"/>
+        </w:rPr>
+        <w:t xml:space="preserve">федеральное государственное бюджетное образовательное</w:t>
+      </w:r>
+      <w:r>
+        <w:rPr>
+          <w:rFonts w:ascii="Times New Roman" w:hAnsi="Times New Roman" w:eastAsia="Times New Roman" w:cs="Times New Roman"/>
+          <w:b w:val="0"/>
           <w:color w:val="000000"/>
+          <w:sz w:val="28"/>
         </w:rPr>
-        <w:t>по лабораторной работе 2</w:t>
+      </w:r>
+      <w:r>
+        <w:rPr>
+          <w:rFonts w:ascii="Times New Roman" w:hAnsi="Times New Roman" w:eastAsia="Times New Roman" w:cs="Times New Roman"/>
+          <w:color w:val="000000"/>
+          <w:sz w:val="28"/>
+        </w:rPr>
       </w:r>
     </w:p>
     <w:p>
       <w:pPr>
-        <w:spacing w:before="0" w:after="280"/>
-        <w:ind w:firstLine="0"/>
+        <w:spacing w:after="0" w:before="0" w:line="360" w:lineRule="auto"/>
+        <w:ind w:right="0" w:firstLine="0" w:left="0"/>
         <w:jc w:val="center"/>
-      </w:pPr>
-      <w:r>
-        <w:rPr>
-          <w:rFonts w:ascii="Times New Roman" w:hAnsi="Times New Roman" w:eastAsia="Times New Roman" w:cs="Times New Roman"/>
-          <w:b/>
-          <w:sz w:val="28"/>
-          <w:color w:val="000000"/>
-        </w:rPr>
-        <w:t>Автоматизированное модульное</w:t>
-        <w:br/>
-        <w:t>тестирование службы доставки</w:t>
-      </w:r>
-    </w:p>
-    <w:p>
-      <w:pPr>
-        <w:spacing w:before="0" w:after="0"/>
-        <w:ind w:firstLine="0"/>
-        <w:jc w:val="center"/>
+        <w:rPr/>
       </w:pPr>
       <w:r>
         <w:rPr>
           <w:rFonts w:ascii="Times New Roman" w:hAnsi="Times New Roman" w:eastAsia="Times New Roman" w:cs="Times New Roman"/>
           <w:b w:val="0"/>
+          <w:color w:val="000000"/>
           <w:sz w:val="28"/>
+        </w:rPr>
+        <w:t xml:space="preserve">учреждение высшего образования</w:t>
+      </w:r>
+      <w:r>
+        <w:rPr>
+          <w:rFonts w:ascii="Times New Roman" w:hAnsi="Times New Roman" w:eastAsia="Times New Roman" w:cs="Times New Roman"/>
+          <w:b w:val="0"/>
           <w:color w:val="000000"/>
+          <w:sz w:val="28"/>
         </w:rPr>
-        <w:t>Дисциплина ______________________________</w:t>
+      </w:r>
+      <w:r>
+        <w:rPr>
+          <w:rFonts w:ascii="Times New Roman" w:hAnsi="Times New Roman" w:eastAsia="Times New Roman" w:cs="Times New Roman"/>
+          <w:color w:val="000000"/>
+          <w:sz w:val="28"/>
+        </w:rPr>
       </w:r>
     </w:p>
     <w:p>
       <w:pPr>
-        <w:spacing w:before="0" w:after="720"/>
-        <w:ind w:firstLine="0"/>
+        <w:spacing w:after="0" w:before="0" w:line="360" w:lineRule="auto"/>
+        <w:ind w:right="0" w:firstLine="0" w:left="0"/>
         <w:jc w:val="center"/>
+        <w:rPr/>
       </w:pPr>
       <w:r>
         <w:rPr>
           <w:rFonts w:ascii="Times New Roman" w:hAnsi="Times New Roman" w:eastAsia="Times New Roman" w:cs="Times New Roman"/>
           <w:b w:val="0"/>
+          <w:color w:val="000000"/>
           <w:sz w:val="28"/>
+        </w:rPr>
+        <w:t xml:space="preserve">«Казанский национальный исследовательский технический</w:t>
+      </w:r>
+      <w:r>
+        <w:rPr>
+          <w:rFonts w:ascii="Times New Roman" w:hAnsi="Times New Roman" w:eastAsia="Times New Roman" w:cs="Times New Roman"/>
+          <w:b w:val="0"/>
           <w:color w:val="000000"/>
+          <w:sz w:val="28"/>
         </w:rPr>
-        <w:t>Вариант 2</w:t>
+      </w:r>
+      <w:r>
+        <w:rPr>
+          <w:rFonts w:ascii="Times New Roman" w:hAnsi="Times New Roman" w:eastAsia="Times New Roman" w:cs="Times New Roman"/>
+          <w:color w:val="000000"/>
+          <w:sz w:val="28"/>
+        </w:rPr>
       </w:r>
     </w:p>
     <w:p>
       <w:pPr>
-        <w:spacing w:after="0"/>
-        <w:ind w:firstLine="0" w:left="3969"/>
-        <w:jc w:val="left"/>
+        <w:spacing w:after="0" w:before="0" w:line="360" w:lineRule="auto"/>
+        <w:ind w:right="0" w:firstLine="0" w:left="0"/>
+        <w:jc w:val="center"/>
+        <w:rPr/>
       </w:pPr>
       <w:r>
         <w:rPr>
           <w:rFonts w:ascii="Times New Roman" w:hAnsi="Times New Roman" w:eastAsia="Times New Roman" w:cs="Times New Roman"/>
           <w:b w:val="0"/>
+          <w:color w:val="000000"/>
           <w:sz w:val="28"/>
+        </w:rPr>
+        <w:t xml:space="preserve">университет им. А.Н. Туполева-КАИ»</w:t>
+      </w:r>
+      <w:r>
+        <w:rPr>
+          <w:rFonts w:ascii="Times New Roman" w:hAnsi="Times New Roman" w:eastAsia="Times New Roman" w:cs="Times New Roman"/>
+          <w:b w:val="0"/>
           <w:color w:val="000000"/>
+          <w:sz w:val="28"/>
         </w:rPr>
-        <w:t>Выполнил студент ________________________</w:t>
-        <w:br/>
-        <w:t>Группа __________________________________</w:t>
-        <w:br/>
-        <w:t>Проверил ________________________________</w:t>
+      </w:r>
+      <w:r>
+        <w:rPr>
+          <w:rFonts w:ascii="Times New Roman" w:hAnsi="Times New Roman" w:eastAsia="Times New Roman" w:cs="Times New Roman"/>
+          <w:color w:val="000000"/>
+          <w:sz w:val="28"/>
+        </w:rPr>
       </w:r>
     </w:p>
     <w:p>
       <w:pPr>
-        <w:spacing w:before="800" w:after="0"/>
-        <w:ind w:firstLine="0"/>
+        <w:spacing w:after="0" w:before="0" w:line="360" w:lineRule="auto"/>
+        <w:ind w:right="0" w:firstLine="0" w:left="0"/>
         <w:jc w:val="center"/>
+        <w:rPr/>
       </w:pPr>
       <w:r>
         <w:rPr>
           <w:rFonts w:ascii="Times New Roman" w:hAnsi="Times New Roman" w:eastAsia="Times New Roman" w:cs="Times New Roman"/>
           <w:b w:val="0"/>
+          <w:color w:val="000000"/>
           <w:sz w:val="28"/>
+        </w:rPr>
+        <w:t xml:space="preserve">(КНИТУ-КАИ)</w:t>
+      </w:r>
+      <w:r>
+        <w:rPr>
+          <w:rFonts w:ascii="Times New Roman" w:hAnsi="Times New Roman" w:eastAsia="Times New Roman" w:cs="Times New Roman"/>
+          <w:b w:val="0"/>
           <w:color w:val="000000"/>
+          <w:sz w:val="28"/>
         </w:rPr>
-        <w:t>Город __________________</w:t>
+      </w:r>
+      <w:r>
+        <w:rPr>
+          <w:rFonts w:ascii="Times New Roman" w:hAnsi="Times New Roman" w:eastAsia="Times New Roman" w:cs="Times New Roman"/>
+          <w:color w:val="000000"/>
+          <w:sz w:val="28"/>
+        </w:rPr>
+      </w:r>
+    </w:p>
+    <w:p>
+      <w:pPr>
+        <w:spacing w:after="0" w:before="0" w:line="360" w:lineRule="auto"/>
+        <w:ind w:right="0" w:left="0"/>
+        <w:jc w:val="center"/>
+        <w:rPr/>
+      </w:pPr>
+      <w:r>
+        <w:rPr>
+          <w:rFonts w:ascii="Times New Roman" w:hAnsi="Times New Roman" w:eastAsia="Times New Roman" w:cs="Times New Roman"/>
+          <w:b w:val="0"/>
+          <w:color w:val="000000"/>
+          <w:sz w:val="28"/>
+        </w:rPr>
+      </w:r>
+      <w:r>
+        <w:rPr>
+          <w:rFonts w:ascii="Times New Roman" w:hAnsi="Times New Roman" w:eastAsia="Times New Roman" w:cs="Times New Roman"/>
+          <w:color w:val="000000"/>
+          <w:sz w:val="28"/>
+        </w:rPr>
+      </w:r>
+    </w:p>
+    <w:p>
+      <w:pPr>
+        <w:spacing w:after="0" w:before="0" w:line="360" w:lineRule="auto"/>
+        <w:ind w:right="0" w:firstLine="0" w:left="0"/>
+        <w:jc w:val="center"/>
+        <w:rPr/>
+      </w:pPr>
+      <w:r>
+        <w:rPr>
+          <w:rFonts w:ascii="Times New Roman" w:hAnsi="Times New Roman" w:eastAsia="Times New Roman" w:cs="Times New Roman"/>
+          <w:b w:val="0"/>
+          <w:color w:val="000000"/>
+          <w:sz w:val="28"/>
+        </w:rPr>
+        <w:t xml:space="preserve">Колледж информационных технологий «КИТ»</w:t>
+      </w:r>
+      <w:r>
+        <w:rPr>
+          <w:rFonts w:ascii="Times New Roman" w:hAnsi="Times New Roman" w:eastAsia="Times New Roman" w:cs="Times New Roman"/>
+          <w:b w:val="0"/>
+          <w:color w:val="000000"/>
+          <w:sz w:val="28"/>
+        </w:rPr>
+      </w:r>
+      <w:r>
+        <w:rPr>
+          <w:rFonts w:ascii="Times New Roman" w:hAnsi="Times New Roman" w:eastAsia="Times New Roman" w:cs="Times New Roman"/>
+          <w:color w:val="000000"/>
+          <w:sz w:val="28"/>
+        </w:rPr>
+      </w:r>
+    </w:p>
+    <w:p>
+      <w:pPr>
+        <w:spacing w:after="0" w:before="0" w:line="360" w:lineRule="auto"/>
+        <w:ind w:right="0" w:left="0"/>
+        <w:jc w:val="center"/>
+        <w:rPr/>
+      </w:pPr>
+      <w:r>
+        <w:rPr>
+          <w:rFonts w:ascii="Times New Roman" w:hAnsi="Times New Roman" w:eastAsia="Times New Roman" w:cs="Times New Roman"/>
+          <w:b w:val="0"/>
+          <w:color w:val="000000"/>
+          <w:sz w:val="28"/>
+        </w:rPr>
+      </w:r>
+      <w:r>
+        <w:rPr>
+          <w:rFonts w:ascii="Times New Roman" w:hAnsi="Times New Roman" w:eastAsia="Times New Roman" w:cs="Times New Roman"/>
+          <w:color w:val="000000"/>
+          <w:sz w:val="28"/>
+        </w:rPr>
+      </w:r>
+    </w:p>
+    <w:p>
+      <w:pPr>
+        <w:spacing w:after="0" w:before="0" w:line="360" w:lineRule="auto"/>
+        <w:ind w:right="0" w:left="0"/>
+        <w:jc w:val="center"/>
+        <w:rPr/>
+      </w:pPr>
+      <w:r>
+        <w:rPr>
+          <w:rFonts w:ascii="Times New Roman" w:hAnsi="Times New Roman" w:eastAsia="Times New Roman" w:cs="Times New Roman"/>
+          <w:b w:val="0"/>
+          <w:color w:val="000000"/>
+          <w:sz w:val="28"/>
+        </w:rPr>
+      </w:r>
+      <w:r>
+        <w:rPr>
+          <w:rFonts w:ascii="Times New Roman" w:hAnsi="Times New Roman" w:eastAsia="Times New Roman" w:cs="Times New Roman"/>
+          <w:color w:val="000000"/>
+          <w:sz w:val="28"/>
+        </w:rPr>
+      </w:r>
+    </w:p>
+    <w:p>
+      <w:pPr>
+        <w:spacing w:after="0" w:before="0" w:line="360" w:lineRule="auto"/>
+        <w:ind w:right="0" w:firstLine="0" w:left="0"/>
+        <w:jc w:val="center"/>
+        <w:rPr/>
+      </w:pPr>
+      <w:r>
+        <w:rPr>
+          <w:rFonts w:ascii="Times New Roman" w:hAnsi="Times New Roman" w:eastAsia="Times New Roman" w:cs="Times New Roman"/>
+          <w:b w:val="0"/>
+          <w:color w:val="000000"/>
+          <w:sz w:val="28"/>
+        </w:rPr>
+        <w:t xml:space="preserve">Дисциплина:</w:t>
+      </w:r>
+      <w:r>
+        <w:rPr>
+          <w:rFonts w:ascii="Times New Roman" w:hAnsi="Times New Roman" w:eastAsia="Times New Roman" w:cs="Times New Roman"/>
+          <w:b w:val="0"/>
+          <w:color w:val="000000"/>
+          <w:sz w:val="28"/>
+        </w:rPr>
+      </w:r>
+      <w:r>
+        <w:rPr>
+          <w:rFonts w:ascii="Times New Roman" w:hAnsi="Times New Roman" w:eastAsia="Times New Roman" w:cs="Times New Roman"/>
+          <w:color w:val="000000"/>
+          <w:sz w:val="28"/>
+        </w:rPr>
+      </w:r>
+    </w:p>
+    <w:p>
+      <w:pPr>
+        <w:spacing w:after="0" w:before="0" w:line="360" w:lineRule="auto"/>
+        <w:ind w:right="0" w:firstLine="0" w:left="0"/>
+        <w:jc w:val="center"/>
+        <w:rPr/>
+      </w:pPr>
+      <w:r>
+        <w:rPr>
+          <w:rFonts w:ascii="Times New Roman" w:hAnsi="Times New Roman" w:eastAsia="Times New Roman" w:cs="Times New Roman"/>
+          <w:b w:val="0"/>
+          <w:color w:val="000000"/>
+          <w:sz w:val="28"/>
+        </w:rPr>
+        <w:t xml:space="preserve">«Поддержка и тестирование программных модулей»</w:t>
+      </w:r>
+      <w:r>
+        <w:rPr>
+          <w:rFonts w:ascii="Times New Roman" w:hAnsi="Times New Roman" w:eastAsia="Times New Roman" w:cs="Times New Roman"/>
+          <w:b w:val="0"/>
+          <w:color w:val="000000"/>
+          <w:sz w:val="28"/>
+        </w:rPr>
+      </w:r>
+      <w:r>
+        <w:rPr>
+          <w:rFonts w:ascii="Times New Roman" w:hAnsi="Times New Roman" w:eastAsia="Times New Roman" w:cs="Times New Roman"/>
+          <w:color w:val="000000"/>
+          <w:sz w:val="28"/>
+        </w:rPr>
+      </w:r>
+    </w:p>
+    <w:p>
+      <w:pPr>
+        <w:spacing w:after="0" w:before="0" w:line="360" w:lineRule="auto"/>
+        <w:ind w:right="0" w:firstLine="0" w:left="0"/>
+        <w:jc w:val="center"/>
+        <w:rPr/>
+      </w:pPr>
+      <w:r>
+        <w:rPr>
+          <w:rFonts w:ascii="Times New Roman" w:hAnsi="Times New Roman" w:eastAsia="Times New Roman" w:cs="Times New Roman"/>
+          <w:b w:val="0"/>
+          <w:color w:val="000000"/>
+          <w:sz w:val="28"/>
+        </w:rPr>
+        <w:t xml:space="preserve">ЛАБОРАТОРНАЯ РАБОТА № 2</w:t>
+      </w:r>
+      <w:r>
+        <w:rPr>
+          <w:rFonts w:ascii="Times New Roman" w:hAnsi="Times New Roman" w:eastAsia="Times New Roman" w:cs="Times New Roman"/>
+          <w:b w:val="0"/>
+          <w:color w:val="000000"/>
+          <w:sz w:val="28"/>
+        </w:rPr>
+      </w:r>
+      <w:r>
+        <w:rPr>
+          <w:rFonts w:ascii="Times New Roman" w:hAnsi="Times New Roman" w:eastAsia="Times New Roman" w:cs="Times New Roman"/>
+          <w:color w:val="000000"/>
+          <w:sz w:val="28"/>
+        </w:rPr>
+      </w:r>
+    </w:p>
+    <w:p>
+      <w:pPr>
+        <w:spacing w:after="0" w:before="0" w:line="360" w:lineRule="auto"/>
+        <w:ind w:right="0" w:firstLine="0" w:left="0"/>
+        <w:jc w:val="center"/>
+        <w:rPr/>
+      </w:pPr>
+      <w:r>
+        <w:rPr>
+          <w:rFonts w:ascii="Times New Roman" w:hAnsi="Times New Roman" w:eastAsia="Times New Roman" w:cs="Times New Roman"/>
+          <w:b w:val="0"/>
+          <w:color w:val="000000"/>
+          <w:sz w:val="28"/>
+        </w:rPr>
+        <w:t xml:space="preserve">на тему:</w:t>
+      </w:r>
+      <w:r>
+        <w:rPr>
+          <w:rFonts w:ascii="Times New Roman" w:hAnsi="Times New Roman" w:eastAsia="Times New Roman" w:cs="Times New Roman"/>
+          <w:b w:val="0"/>
+          <w:color w:val="000000"/>
+          <w:sz w:val="28"/>
+        </w:rPr>
+      </w:r>
+      <w:r>
+        <w:rPr>
+          <w:rFonts w:ascii="Times New Roman" w:hAnsi="Times New Roman" w:eastAsia="Times New Roman" w:cs="Times New Roman"/>
+          <w:color w:val="000000"/>
+          <w:sz w:val="28"/>
+        </w:rPr>
+      </w:r>
+    </w:p>
+    <w:p>
+      <w:pPr>
+        <w:spacing w:after="0" w:before="0" w:line="360" w:lineRule="auto"/>
+        <w:ind w:right="0" w:firstLine="0" w:left="0"/>
+        <w:jc w:val="center"/>
+        <w:rPr/>
+      </w:pPr>
+      <w:r>
+        <w:rPr>
+          <w:rFonts w:ascii="Times New Roman" w:hAnsi="Times New Roman" w:eastAsia="Times New Roman" w:cs="Times New Roman"/>
+          <w:b w:val="0"/>
+          <w:color w:val="000000"/>
+          <w:sz w:val="28"/>
+        </w:rPr>
+        <w:t xml:space="preserve">«Автоматизированное модульное тестирование»</w:t>
+      </w:r>
+      <w:r>
+        <w:rPr>
+          <w:rFonts w:ascii="Times New Roman" w:hAnsi="Times New Roman" w:eastAsia="Times New Roman" w:cs="Times New Roman"/>
+          <w:b w:val="0"/>
+          <w:color w:val="000000"/>
+          <w:sz w:val="28"/>
+        </w:rPr>
+      </w:r>
+      <w:r>
+        <w:rPr>
+          <w:rFonts w:ascii="Times New Roman" w:hAnsi="Times New Roman" w:eastAsia="Times New Roman" w:cs="Times New Roman"/>
+          <w:color w:val="000000"/>
+          <w:sz w:val="28"/>
+        </w:rPr>
+      </w:r>
+    </w:p>
+    <w:p>
+      <w:pPr>
+        <w:spacing w:after="0" w:before="0" w:line="360" w:lineRule="auto"/>
+        <w:ind w:right="0" w:firstLine="0" w:left="0"/>
+        <w:jc w:val="center"/>
+        <w:rPr/>
+      </w:pPr>
+      <w:r>
+        <w:rPr>
+          <w:rFonts w:ascii="Times New Roman" w:hAnsi="Times New Roman" w:eastAsia="Times New Roman" w:cs="Times New Roman"/>
+          <w:b w:val="0"/>
+          <w:color w:val="000000"/>
+          <w:sz w:val="28"/>
+        </w:rPr>
+        <w:t xml:space="preserve">Вариант 2. Предметная область: «Служба доставки»</w:t>
+      </w:r>
+      <w:r>
+        <w:rPr>
+          <w:rFonts w:ascii="Times New Roman" w:hAnsi="Times New Roman" w:eastAsia="Times New Roman" w:cs="Times New Roman"/>
+          <w:b w:val="0"/>
+          <w:color w:val="000000"/>
+          <w:sz w:val="28"/>
+        </w:rPr>
+      </w:r>
+      <w:r>
+        <w:rPr>
+          <w:rFonts w:ascii="Times New Roman" w:hAnsi="Times New Roman" w:eastAsia="Times New Roman" w:cs="Times New Roman"/>
+          <w:color w:val="000000"/>
+          <w:sz w:val="28"/>
+        </w:rPr>
+      </w:r>
+    </w:p>
+    <w:p>
+      <w:pPr>
+        <w:spacing w:after="0" w:before="0" w:line="360" w:lineRule="auto"/>
+        <w:ind w:right="0" w:left="0"/>
+        <w:jc w:val="center"/>
+        <w:rPr/>
+      </w:pPr>
+      <w:r>
+        <w:rPr>
+          <w:rFonts w:ascii="Times New Roman" w:hAnsi="Times New Roman" w:eastAsia="Times New Roman" w:cs="Times New Roman"/>
+          <w:b w:val="0"/>
+          <w:color w:val="000000"/>
+          <w:sz w:val="28"/>
+        </w:rPr>
         <w:br/>
-        <w:t>2026</w:t>
+        <w:br/>
+      </w:r>
+      <w:r>
+        <w:rPr>
+          <w:rFonts w:ascii="Times New Roman" w:hAnsi="Times New Roman" w:eastAsia="Times New Roman" w:cs="Times New Roman"/>
+          <w:color w:val="000000"/>
+          <w:sz w:val="28"/>
+        </w:rPr>
+      </w:r>
+    </w:p>
+    <w:p>
+      <w:pPr>
+        <w:spacing w:after="0" w:before="0" w:line="360" w:lineRule="auto"/>
+        <w:ind w:right="0" w:left="0"/>
+        <w:jc w:val="center"/>
+        <w:rPr/>
+      </w:pPr>
+      <w:r>
+        <w:rPr>
+          <w:rFonts w:ascii="Times New Roman" w:hAnsi="Times New Roman" w:eastAsia="Times New Roman" w:cs="Times New Roman"/>
+          <w:b w:val="0"/>
+          <w:color w:val="000000"/>
+          <w:sz w:val="28"/>
+        </w:rPr>
+      </w:r>
+      <w:r>
+        <w:rPr>
+          <w:rFonts w:ascii="Times New Roman" w:hAnsi="Times New Roman" w:eastAsia="Times New Roman" w:cs="Times New Roman"/>
+          <w:color w:val="000000"/>
+          <w:sz w:val="28"/>
+        </w:rPr>
+      </w:r>
+    </w:p>
+    <w:tbl>
+      <w:tblPr>
+        <w:tblInd w:w="4536" w:type="dxa"/>
+        <w:tblW w:w="5210" w:type="dxa"/>
+        <w:tblBorders>
+          <w:top w:val="none" w:color="auto" w:sz="0" w:space="0"/>
+          <w:left w:val="none" w:color="auto" w:sz="0" w:space="0"/>
+          <w:bottom w:val="none" w:color="auto" w:sz="0" w:space="0"/>
+          <w:right w:val="none" w:color="auto" w:sz="0" w:space="0"/>
+          <w:insideH w:val="none" w:color="auto" w:sz="0" w:space="0"/>
+          <w:insideV w:val="none" w:color="auto" w:sz="0" w:space="0"/>
+        </w:tblBorders>
+        <w:tblLayout w:type="fixed"/>
+        <w:tblLook w:val="04A0" w:firstRow="1" w:lastRow="0" w:firstColumn="1" w:lastColumn="0" w:noHBand="0" w:noVBand="1"/>
+      </w:tblPr>
+      <w:tblGrid>
+        <w:gridCol w:w="1666"/>
+        <w:gridCol w:w="3543"/>
+      </w:tblGrid>
+      <w:tr>
+        <w:trPr/>
+        <w:tc>
+          <w:tcPr>
+            <w:tcBorders/>
+            <w:tcW w:w="1666" w:type="dxa"/>
+            <w:vAlign w:val="center"/>
+          </w:tcPr>
+          <w:p>
+            <w:pPr>
+              <w:spacing w:after="0" w:before="0" w:line="360" w:lineRule="auto"/>
+              <w:ind w:right="0" w:firstLine="0" w:left="0"/>
+              <w:jc w:val="left"/>
+              <w:rPr/>
+            </w:pPr>
+            <w:r>
+              <w:rPr>
+                <w:rFonts w:ascii="Times New Roman" w:hAnsi="Times New Roman" w:eastAsia="Times New Roman" w:cs="Times New Roman"/>
+                <w:color w:val="000000"/>
+                <w:sz w:val="28"/>
+              </w:rPr>
+            </w:r>
+            <w:r>
+              <w:rPr>
+                <w:rFonts w:ascii="Times New Roman" w:hAnsi="Times New Roman" w:eastAsia="Times New Roman" w:cs="Times New Roman"/>
+                <w:b w:val="0"/>
+                <w:color w:val="000000"/>
+                <w:sz w:val="28"/>
+              </w:rPr>
+              <w:t xml:space="preserve">Выполнил:</w:t>
+            </w:r>
+            <w:r>
+              <w:rPr>
+                <w:rFonts w:ascii="Times New Roman" w:hAnsi="Times New Roman" w:eastAsia="Times New Roman" w:cs="Times New Roman"/>
+                <w:color w:val="000000"/>
+                <w:sz w:val="28"/>
+              </w:rPr>
+            </w:r>
+          </w:p>
+        </w:tc>
+        <w:tc>
+          <w:tcPr>
+            <w:tcBorders/>
+            <w:tcW w:w="3543" w:type="dxa"/>
+            <w:vAlign w:val="center"/>
+          </w:tcPr>
+          <w:p>
+            <w:pPr>
+              <w:spacing w:after="0" w:before="0" w:line="360" w:lineRule="auto"/>
+              <w:ind w:right="0" w:firstLine="0" w:left="0"/>
+              <w:jc w:val="right"/>
+              <w:rPr/>
+            </w:pPr>
+            <w:r>
+              <w:rPr>
+                <w:rFonts w:ascii="Times New Roman" w:hAnsi="Times New Roman" w:eastAsia="Times New Roman" w:cs="Times New Roman"/>
+                <w:color w:val="000000"/>
+                <w:sz w:val="28"/>
+              </w:rPr>
+            </w:r>
+            <w:r>
+              <w:rPr>
+                <w:rFonts w:ascii="Times New Roman" w:hAnsi="Times New Roman" w:eastAsia="Times New Roman" w:cs="Times New Roman"/>
+                <w:b w:val="0"/>
+                <w:color w:val="000000"/>
+                <w:sz w:val="28"/>
+              </w:rPr>
+              <w:t xml:space="preserve">Обучающийся группы ____</w:t>
+            </w:r>
+            <w:r>
+              <w:rPr>
+                <w:rFonts w:ascii="Times New Roman" w:hAnsi="Times New Roman" w:eastAsia="Times New Roman" w:cs="Times New Roman"/>
+                <w:color w:val="000000"/>
+                <w:sz w:val="28"/>
+              </w:rPr>
+            </w:r>
+          </w:p>
+        </w:tc>
+      </w:tr>
+      <w:tr>
+        <w:trPr/>
+        <w:tc>
+          <w:tcPr>
+            <w:tcBorders/>
+            <w:tcW w:w="1666" w:type="dxa"/>
+            <w:vAlign w:val="center"/>
+          </w:tcPr>
+          <w:p>
+            <w:pPr>
+              <w:spacing w:after="0" w:before="0" w:line="360" w:lineRule="auto"/>
+              <w:ind w:right="0" w:firstLine="0" w:left="0"/>
+              <w:jc w:val="left"/>
+              <w:rPr/>
+            </w:pPr>
+            <w:r>
+              <w:rPr>
+                <w:rFonts w:ascii="Times New Roman" w:hAnsi="Times New Roman" w:eastAsia="Times New Roman" w:cs="Times New Roman"/>
+                <w:color w:val="000000"/>
+                <w:sz w:val="28"/>
+              </w:rPr>
+            </w:r>
+            <w:r>
+              <w:rPr>
+                <w:rFonts w:ascii="Times New Roman" w:hAnsi="Times New Roman" w:eastAsia="Times New Roman" w:cs="Times New Roman"/>
+                <w:b w:val="0"/>
+                <w:color w:val="000000"/>
+                <w:sz w:val="28"/>
+              </w:rPr>
+            </w:r>
+            <w:r>
+              <w:rPr>
+                <w:rFonts w:ascii="Times New Roman" w:hAnsi="Times New Roman" w:eastAsia="Times New Roman" w:cs="Times New Roman"/>
+                <w:color w:val="000000"/>
+                <w:sz w:val="28"/>
+              </w:rPr>
+            </w:r>
+          </w:p>
+        </w:tc>
+        <w:tc>
+          <w:tcPr>
+            <w:tcBorders/>
+            <w:tcW w:w="3543" w:type="dxa"/>
+            <w:vAlign w:val="center"/>
+          </w:tcPr>
+          <w:p>
+            <w:pPr>
+              <w:spacing w:after="0" w:before="0" w:line="360" w:lineRule="auto"/>
+              <w:ind w:right="0" w:firstLine="0" w:left="0"/>
+              <w:jc w:val="right"/>
+              <w:rPr/>
+            </w:pPr>
+            <w:r>
+              <w:rPr>
+                <w:rFonts w:ascii="Times New Roman" w:hAnsi="Times New Roman" w:eastAsia="Times New Roman" w:cs="Times New Roman"/>
+                <w:color w:val="000000"/>
+                <w:sz w:val="28"/>
+              </w:rPr>
+            </w:r>
+            <w:r>
+              <w:rPr>
+                <w:rFonts w:ascii="Times New Roman" w:hAnsi="Times New Roman" w:eastAsia="Times New Roman" w:cs="Times New Roman"/>
+                <w:b w:val="0"/>
+                <w:color w:val="000000"/>
+                <w:sz w:val="28"/>
+              </w:rPr>
+              <w:t xml:space="preserve">ФИО ________________</w:t>
+            </w:r>
+            <w:r>
+              <w:rPr>
+                <w:rFonts w:ascii="Times New Roman" w:hAnsi="Times New Roman" w:eastAsia="Times New Roman" w:cs="Times New Roman"/>
+                <w:color w:val="000000"/>
+                <w:sz w:val="28"/>
+              </w:rPr>
+            </w:r>
+          </w:p>
+        </w:tc>
+      </w:tr>
+      <w:tr>
+        <w:trPr/>
+        <w:tc>
+          <w:tcPr>
+            <w:tcBorders/>
+            <w:tcW w:w="1666" w:type="dxa"/>
+            <w:vAlign w:val="center"/>
+          </w:tcPr>
+          <w:p>
+            <w:pPr>
+              <w:spacing w:after="0" w:before="0" w:line="360" w:lineRule="auto"/>
+              <w:ind w:right="0" w:firstLine="0" w:left="0"/>
+              <w:jc w:val="left"/>
+              <w:rPr/>
+            </w:pPr>
+            <w:r>
+              <w:rPr>
+                <w:rFonts w:ascii="Times New Roman" w:hAnsi="Times New Roman" w:eastAsia="Times New Roman" w:cs="Times New Roman"/>
+                <w:color w:val="000000"/>
+                <w:sz w:val="28"/>
+              </w:rPr>
+            </w:r>
+            <w:r>
+              <w:rPr>
+                <w:rFonts w:ascii="Times New Roman" w:hAnsi="Times New Roman" w:eastAsia="Times New Roman" w:cs="Times New Roman"/>
+                <w:b w:val="0"/>
+                <w:color w:val="000000"/>
+                <w:sz w:val="28"/>
+              </w:rPr>
+              <w:t xml:space="preserve">Проверил:</w:t>
+            </w:r>
+            <w:r>
+              <w:rPr>
+                <w:rFonts w:ascii="Times New Roman" w:hAnsi="Times New Roman" w:eastAsia="Times New Roman" w:cs="Times New Roman"/>
+                <w:color w:val="000000"/>
+                <w:sz w:val="28"/>
+              </w:rPr>
+            </w:r>
+          </w:p>
+        </w:tc>
+        <w:tc>
+          <w:tcPr>
+            <w:tcBorders/>
+            <w:tcW w:w="3543" w:type="dxa"/>
+            <w:vAlign w:val="center"/>
+          </w:tcPr>
+          <w:p>
+            <w:pPr>
+              <w:spacing w:after="0" w:before="0" w:line="360" w:lineRule="auto"/>
+              <w:ind w:right="0" w:firstLine="0" w:left="0"/>
+              <w:jc w:val="right"/>
+              <w:rPr/>
+            </w:pPr>
+            <w:r>
+              <w:rPr>
+                <w:rFonts w:ascii="Times New Roman" w:hAnsi="Times New Roman" w:eastAsia="Times New Roman" w:cs="Times New Roman"/>
+                <w:color w:val="000000"/>
+                <w:sz w:val="28"/>
+              </w:rPr>
+            </w:r>
+            <w:r>
+              <w:rPr>
+                <w:rFonts w:ascii="Times New Roman" w:hAnsi="Times New Roman" w:eastAsia="Times New Roman" w:cs="Times New Roman"/>
+                <w:b w:val="0"/>
+                <w:color w:val="000000"/>
+                <w:sz w:val="28"/>
+              </w:rPr>
+              <w:t xml:space="preserve">Тарасов Д.Е.</w:t>
+            </w:r>
+            <w:r>
+              <w:rPr>
+                <w:rFonts w:ascii="Times New Roman" w:hAnsi="Times New Roman" w:eastAsia="Times New Roman" w:cs="Times New Roman"/>
+                <w:color w:val="000000"/>
+                <w:sz w:val="28"/>
+              </w:rPr>
+            </w:r>
+          </w:p>
+        </w:tc>
+      </w:tr>
+    </w:tbl>
+    <w:p>
+      <w:pPr>
+        <w:spacing/>
+        <w:ind w:firstLine="0"/>
+        <w:jc w:val="center"/>
+        <w:rPr>
+          <w:rFonts w:ascii="Times New Roman" w:hAnsi="Times New Roman" w:eastAsia="Times New Roman"/>
+          <w:b w:val="0"/>
+          <w:bCs w:val="0"/>
+          <w:color w:val="000000"/>
+          <w:sz w:val="28"/>
+          <w:szCs w:val="28"/>
+          <w:highlight w:val="none"/>
+        </w:rPr>
+      </w:pPr>
+      <w:r>
+        <w:rPr>
+          <w:rFonts w:ascii="Times New Roman" w:hAnsi="Times New Roman" w:eastAsia="Times New Roman" w:cs="Times New Roman"/>
+          <w:b w:val="0"/>
+          <w:color w:val="000000"/>
+          <w:sz w:val="28"/>
+          <w:highlight w:val="none"/>
+        </w:rPr>
+      </w:r>
+      <w:r>
+        <w:rPr>
+          <w:rFonts w:ascii="Times New Roman" w:hAnsi="Times New Roman" w:eastAsia="Times New Roman" w:cs="Times New Roman"/>
+          <w:b w:val="0"/>
+          <w:bCs w:val="0"/>
+          <w:color w:val="000000"/>
+          <w:sz w:val="28"/>
+          <w:szCs w:val="28"/>
+          <w:highlight w:val="none"/>
+        </w:rPr>
+      </w:r>
+      <w:r>
+        <w:rPr>
+          <w:rFonts w:ascii="Times New Roman" w:hAnsi="Times New Roman" w:eastAsia="Times New Roman" w:cs="Times New Roman"/>
+          <w:b w:val="0"/>
+          <w:bCs w:val="0"/>
+          <w:color w:val="000000"/>
+          <w:sz w:val="28"/>
+          <w:szCs w:val="28"/>
+          <w:highlight w:val="none"/>
+        </w:rPr>
+      </w:r>
+    </w:p>
+    <w:p>
+      <w:pPr>
+        <w:spacing w:after="0" w:before="0" w:line="360" w:lineRule="auto"/>
+        <w:ind w:right="0" w:firstLine="0" w:left="0"/>
+        <w:jc w:val="center"/>
+        <w:rPr>
+          <w:rFonts w:ascii="Times New Roman" w:hAnsi="Times New Roman" w:eastAsia="Times New Roman"/>
+          <w:b w:val="0"/>
+          <w:bCs w:val="0"/>
+          <w:color w:val="000000"/>
+          <w:sz w:val="28"/>
+          <w:szCs w:val="28"/>
+          <w:highlight w:val="none"/>
+        </w:rPr>
+      </w:pPr>
+      <w:r>
+        <w:rPr>
+          <w:rFonts w:ascii="Times New Roman" w:hAnsi="Times New Roman" w:eastAsia="Times New Roman" w:cs="Times New Roman"/>
+          <w:b w:val="0"/>
+          <w:color w:val="000000"/>
+          <w:sz w:val="28"/>
+        </w:rPr>
+        <w:t xml:space="preserve">Казань 2026г.</w:t>
+      </w:r>
+      <w:r>
+        <w:rPr>
+          <w:rFonts w:ascii="Times New Roman" w:hAnsi="Times New Roman" w:eastAsia="Times New Roman" w:cs="Times New Roman"/>
+          <w:color w:val="000000"/>
+          <w:sz w:val="28"/>
+        </w:rPr>
+      </w:r>
+      <w:r>
+        <w:rPr>
+          <w:rFonts w:ascii="Times New Roman" w:hAnsi="Times New Roman" w:eastAsia="Times New Roman" w:cs="Times New Roman"/>
+          <w:b w:val="0"/>
+          <w:bCs w:val="0"/>
+          <w:color w:val="000000"/>
+          <w:sz w:val="28"/>
+          <w:szCs w:val="28"/>
+          <w:highlight w:val="none"/>
+        </w:rPr>
+      </w:r>
+      <w:r>
+        <w:rPr>
+          <w:rFonts w:ascii="Times New Roman" w:hAnsi="Times New Roman" w:eastAsia="Times New Roman" w:cs="Times New Roman"/>
+          <w:b w:val="0"/>
+          <w:bCs w:val="0"/>
+          <w:color w:val="000000"/>
+          <w:sz w:val="28"/>
+          <w:szCs w:val="28"/>
+          <w:highlight w:val="none"/>
+        </w:rPr>
       </w:r>
     </w:p>
     <w:p>
@@ -167,8 +932,8 @@
       <w:r>
         <w:rPr>
           <w:rFonts w:ascii="Times New Roman" w:hAnsi="Times New Roman" w:eastAsia="Times New Roman" w:cs="Times New Roman"/>
+          <w:color w:val="000000"/>
           <w:sz w:val="28"/>
-          <w:color w:val="000000"/>
         </w:rPr>
         <w:t>1 Анализ исходного кода</w:t>
       </w:r>
@@ -181,8 +946,8 @@
         <w:rPr>
           <w:rFonts w:ascii="Times New Roman" w:hAnsi="Times New Roman" w:eastAsia="Times New Roman" w:cs="Times New Roman"/>
           <w:b w:val="0"/>
+          <w:color w:val="000000"/>
           <w:sz w:val="28"/>
-          <w:color w:val="000000"/>
         </w:rPr>
         <w:t>Цель работы — освоить модульное тестирование бизнес логики на C# с применением xUnit и FluentAssertions, измерить покрытие строк и ветвей с помощью Coverlet и достичь не менее 90% по обеим метрикам. Исходный код службы доставки разработан самостоятельно по TDD. Итоговый набор из 77 тестовых случаев проходит, покрытие строк и ветвей составляет 100%.</w:t>
       </w:r>
@@ -195,8 +960,8 @@
         <w:rPr>
           <w:rFonts w:ascii="Times New Roman" w:hAnsi="Times New Roman" w:eastAsia="Times New Roman" w:cs="Times New Roman"/>
           <w:b w:val="0"/>
+          <w:color w:val="000000"/>
           <w:sz w:val="28"/>
-          <w:color w:val="000000"/>
         </w:rPr>
         <w:t>Объект тестирования — метод CalculateCost класса DeliveryCalculator из проекта Lab2.Core. На вход передается DeliveryRequest: расстояние DistanceKm и вес WeightKg типа decimal, тип Standard, Express или Overnight, флаги IsFragile и IsInsured, объявленная стоимость DeclaredValue типа decimal. Метод возвращает стоимость доставки в рублях.</w:t>
       </w:r>
@@ -209,8 +974,8 @@
         <w:rPr>
           <w:rFonts w:ascii="Times New Roman" w:hAnsi="Times New Roman" w:eastAsia="Times New Roman" w:cs="Times New Roman"/>
           <w:b w:val="0"/>
+          <w:color w:val="000000"/>
           <w:sz w:val="28"/>
-          <w:color w:val="000000"/>
         </w:rPr>
         <w:t>Валидация допускает расстояние больше 0 и не больше 5000 км, вес больше 0 и не больше 1000 кг. Нарушение вызывает ArgumentException. Дополнительно проверяются null и неопределенное значение типа доставки. Эти проверки защищают модуль от некорректной заявки.</w:t>
       </w:r>
@@ -223,8 +988,8 @@
         <w:rPr>
           <w:rFonts w:ascii="Times New Roman" w:hAnsi="Times New Roman" w:eastAsia="Times New Roman" w:cs="Times New Roman"/>
           <w:b w:val="0"/>
+          <w:color w:val="000000"/>
           <w:sz w:val="28"/>
-          <w:color w:val="000000"/>
         </w:rPr>
         <w:t>Базовый тариф определяется по расстоянию. Границы 10, 100 и 1000 км включаются в предшествующий диапазон. Таким образом, на самих границах стоимость непрерывна: 200, 2000 и 15500 руб. соответственно.</w:t>
       </w:r>
@@ -237,8 +1002,8 @@
       <w:r>
         <w:rPr>
           <w:rFonts w:ascii="Times New Roman" w:hAnsi="Times New Roman" w:eastAsia="Times New Roman" w:cs="Times New Roman"/>
+          <w:color w:val="000000"/>
           <w:sz w:val="28"/>
-          <w:color w:val="000000"/>
         </w:rPr>
         <w:t>Таблица 1 — Базовые тарифы</w:t>
       </w:r>
@@ -525,8 +1290,8 @@
       <w:r>
         <w:rPr>
           <w:rFonts w:ascii="Times New Roman" w:hAnsi="Times New Roman" w:eastAsia="Times New Roman" w:cs="Times New Roman"/>
+          <w:color w:val="000000"/>
           <w:sz w:val="28"/>
-          <w:color w:val="000000"/>
         </w:rPr>
         <w:t>Надбавки и порядок расчета</w:t>
       </w:r>
@@ -539,8 +1304,8 @@
         <w:rPr>
           <w:rFonts w:ascii="Times New Roman" w:hAnsi="Times New Roman" w:eastAsia="Times New Roman" w:cs="Times New Roman"/>
           <w:b w:val="0"/>
+          <w:color w:val="000000"/>
           <w:sz w:val="28"/>
-          <w:color w:val="000000"/>
         </w:rPr>
         <w:t>Надбавка за вес равна 0 руб. до 5 кг включительно, 100 руб. свыше 5 до 20 кг, 300 руб. свыше 20 до 100 кг и 500 руб. свыше 100 кг. Коэффициент доставки умножает только базовый тариф: Standard — 1, Express — 1,5, Overnight — 2,5.</w:t>
       </w:r>
@@ -553,8 +1318,8 @@
         <w:rPr>
           <w:rFonts w:ascii="Times New Roman" w:hAnsi="Times New Roman" w:eastAsia="Times New Roman" w:cs="Times New Roman"/>
           <w:b w:val="0"/>
+          <w:color w:val="000000"/>
           <w:sz w:val="28"/>
-          <w:color w:val="000000"/>
         </w:rPr>
         <w:t>После умножения базового тарифа прибавляется надбавка за вес. Если груз хрупкий, полученная сумма увеличивается на 15%. Затем начисляется страховка: при IsInsured = true и DeclaredValue &gt; 0 берутся 2% объявленной стоимости, но не менее 100 руб. При отрицательной или нулевой стоимости страховка не начисляется. Отдельного исключения для нее методичка не требует.</w:t>
       </w:r>
@@ -567,8 +1332,8 @@
         <w:rPr>
           <w:rFonts w:ascii="Times New Roman" w:hAnsi="Times New Roman" w:eastAsia="Times New Roman" w:cs="Times New Roman"/>
           <w:b w:val="0"/>
+          <w:color w:val="000000"/>
           <w:sz w:val="28"/>
-          <w:color w:val="000000"/>
         </w:rPr>
         <w:t>В завершение применяется ограничение 50000 руб. Пример: расстояние 50 км, вес 20 кг, Express, хрупкий и застрахованный груз стоимостью 10000 руб. Базовый тариф равен 1000 руб.; расчет: (1000 × 1,5 + 100) × 1,15 + 200 = 2040 руб. Страховая сумма добавляется после надбавки за хрупкость, в порядке пунктов задания.</w:t>
       </w:r>
@@ -581,8 +1346,8 @@
         <w:rPr>
           <w:rFonts w:ascii="Times New Roman" w:hAnsi="Times New Roman" w:eastAsia="Times New Roman" w:cs="Times New Roman"/>
           <w:b w:val="0"/>
+          <w:color w:val="000000"/>
           <w:sz w:val="28"/>
-          <w:color w:val="000000"/>
         </w:rPr>
         <w:t>Для денежных вычислений используется decimal. Округление результата не вводится, поскольку оно не указано в варианте. Например, для 10,001 км обычная доставка стоит 200,020 руб. Метод не изменяет входную заявку и не обращается к сети, файлам или базе данных.</w:t>
       </w:r>
@@ -595,8 +1360,8 @@
         <w:rPr>
           <w:rFonts w:ascii="Times New Roman" w:hAnsi="Times New Roman" w:eastAsia="Times New Roman" w:cs="Times New Roman"/>
           <w:b w:val="0"/>
+          <w:color w:val="000000"/>
           <w:sz w:val="28"/>
-          <w:color w:val="000000"/>
         </w:rPr>
         <w:t>В исходном коде выделены ветви валидации, четыре диапазона расстояния, четыре диапазона веса, три типа доставки и отказ для неизвестного типа, две ветви хрупкости, условие страховки и обе стороны ее минимальной суммы. Предел проверяется значениями ниже, на границе и выше 50000 руб. Матрица сценариев составлена до реализации модуля и приведена далее.</w:t>
       </w:r>
@@ -609,8 +1374,8 @@
       <w:r>
         <w:rPr>
           <w:rFonts w:ascii="Times New Roman" w:hAnsi="Times New Roman" w:eastAsia="Times New Roman" w:cs="Times New Roman"/>
+          <w:color w:val="000000"/>
           <w:sz w:val="28"/>
-          <w:color w:val="000000"/>
         </w:rPr>
         <w:t>Матрица тестовых сценариев</w:t>
       </w:r>
@@ -623,8 +1388,8 @@
         <w:rPr>
           <w:rFonts w:ascii="Times New Roman" w:hAnsi="Times New Roman" w:eastAsia="Times New Roman" w:cs="Times New Roman"/>
           <w:b w:val="0"/>
+          <w:color w:val="000000"/>
           <w:sz w:val="28"/>
-          <w:color w:val="000000"/>
         </w:rPr>
         <w:t>Один сценарий может включать несколько наборов InlineData. По умолчанию используются расстояние 5 км, вес 1 кг, Standard, без страховки и хрупкости. Все суммы приведены в рублях.</w:t>
       </w:r>
@@ -637,8 +1402,8 @@
       <w:r>
         <w:rPr>
           <w:rFonts w:ascii="Times New Roman" w:hAnsi="Times New Roman" w:eastAsia="Times New Roman" w:cs="Times New Roman"/>
+          <w:color w:val="000000"/>
           <w:sz w:val="28"/>
-          <w:color w:val="000000"/>
         </w:rPr>
         <w:t>Таблица 2 — Матрица тестовых сценариев</w:t>
       </w:r>
@@ -1344,8 +2109,8 @@
       <w:r>
         <w:rPr>
           <w:rFonts w:ascii="Times New Roman" w:hAnsi="Times New Roman" w:eastAsia="Times New Roman" w:cs="Times New Roman"/>
+          <w:color w:val="000000"/>
           <w:sz w:val="28"/>
-          <w:color w:val="000000"/>
         </w:rPr>
         <w:t>Продолжение таблицы 2</w:t>
       </w:r>
@@ -2043,8 +2808,8 @@
       <w:r>
         <w:rPr>
           <w:rFonts w:ascii="Times New Roman" w:hAnsi="Times New Roman" w:eastAsia="Times New Roman" w:cs="Times New Roman"/>
+          <w:color w:val="000000"/>
           <w:sz w:val="28"/>
-          <w:color w:val="000000"/>
         </w:rPr>
         <w:t>Продолжение таблицы 2</w:t>
       </w:r>
@@ -2742,8 +3507,8 @@
       <w:r>
         <w:rPr>
           <w:rFonts w:ascii="Times New Roman" w:hAnsi="Times New Roman" w:eastAsia="Times New Roman" w:cs="Times New Roman"/>
+          <w:color w:val="000000"/>
           <w:sz w:val="28"/>
-          <w:color w:val="000000"/>
         </w:rPr>
         <w:t>Продолжение таблицы 2</w:t>
       </w:r>
@@ -3443,8 +4208,8 @@
       <w:r>
         <w:rPr>
           <w:rFonts w:ascii="Times New Roman" w:hAnsi="Times New Roman" w:eastAsia="Times New Roman" w:cs="Times New Roman"/>
+          <w:color w:val="000000"/>
           <w:sz w:val="28"/>
-          <w:color w:val="000000"/>
         </w:rPr>
         <w:t>Продолжение таблицы 2</w:t>
       </w:r>
@@ -4142,8 +4907,8 @@
       <w:r>
         <w:rPr>
           <w:rFonts w:ascii="Times New Roman" w:hAnsi="Times New Roman" w:eastAsia="Times New Roman" w:cs="Times New Roman"/>
+          <w:color w:val="000000"/>
           <w:sz w:val="28"/>
-          <w:color w:val="000000"/>
         </w:rPr>
         <w:t>Продолжение таблицы 2</w:t>
       </w:r>
@@ -4840,10 +5605,11 @@
       <w:r>
         <w:rPr>
           <w:rFonts w:ascii="Times New Roman" w:hAnsi="Times New Roman" w:eastAsia="Times New Roman" w:cs="Times New Roman"/>
+          <w:b/>
+          <w:color w:val="000000"/>
           <w:sz w:val="28"/>
-          <w:color w:val="000000"/>
         </w:rPr>
-        <w:t>2 Реализация Unit тестов</w:t>
+        <w:t>2 Реализация Unit-тестов</w:t>
       </w:r>
     </w:p>
     <w:p>
@@ -4854,8 +5620,8 @@
         <w:rPr>
           <w:rFonts w:ascii="Times New Roman" w:hAnsi="Times New Roman" w:eastAsia="Times New Roman" w:cs="Times New Roman"/>
           <w:b w:val="0"/>
+          <w:color w:val="000000"/>
           <w:sz w:val="28"/>
-          <w:color w:val="000000"/>
         </w:rPr>
         <w:t>Решение Lab2.sln содержит ровно два проекта. Lab2.Core — библиотека классов с DeliveryRequest, DeliveryType и DeliveryCalculator. Lab2.Tests — тестовый проект xUnit со ссылкой на библиотеку. Подключены Microsoft.NET.Test.Sdk, xunit, xunit.runner.visualstudio, FluentAssertions и два предусмотренных методичкой способа интеграции Coverlet.</w:t>
       </w:r>
@@ -4868,8 +5634,8 @@
         <w:rPr>
           <w:rFonts w:ascii="Times New Roman" w:hAnsi="Times New Roman" w:eastAsia="Times New Roman" w:cs="Times New Roman"/>
           <w:b w:val="0"/>
+          <w:color w:val="000000"/>
           <w:sz w:val="28"/>
-          <w:color w:val="000000"/>
         </w:rPr>
         <w:t>coverlet.collector используется по умолчанию для команды --collect. coverlet.msbuild включается свойством CoverageTool=msbuild для измерения покрытия через MSBuild. Пакеты выбираются по отдельности, чтобы одновременно не подключать две интеграции. ReportGenerator восстановлен из локального манифеста .config/dotnet-tools.json.</w:t>
       </w:r>
@@ -4882,8 +5648,8 @@
         <w:rPr>
           <w:rFonts w:ascii="Times New Roman" w:hAnsi="Times New Roman" w:eastAsia="Times New Roman" w:cs="Times New Roman"/>
           <w:b w:val="0"/>
+          <w:color w:val="000000"/>
           <w:sz w:val="28"/>
-          <w:color w:val="000000"/>
         </w:rPr>
         <w:t>После подготовки успешно выполнен пустой шаблонный тест. Затем он удален: итоговый набор содержит только проверки предметной области. Тесты разделены на ValidationTests, TariffTests, InsuranceTests и LimitAndQualityTests. TestRequests создает независимую заявку для каждого запуска.</w:t>
       </w:r>
@@ -4896,8 +5662,8 @@
       <w:r>
         <w:rPr>
           <w:rFonts w:ascii="Times New Roman" w:hAnsi="Times New Roman" w:eastAsia="Times New Roman" w:cs="Times New Roman"/>
+          <w:color w:val="000000"/>
           <w:sz w:val="28"/>
-          <w:color w:val="000000"/>
         </w:rPr>
         <w:t>Разработка по TDD</w:t>
       </w:r>
@@ -4910,8 +5676,8 @@
         <w:rPr>
           <w:rFonts w:ascii="Times New Roman" w:hAnsi="Times New Roman" w:eastAsia="Times New Roman" w:cs="Times New Roman"/>
           <w:b w:val="0"/>
+          <w:color w:val="000000"/>
           <w:sz w:val="28"/>
-          <w:color w:val="000000"/>
         </w:rPr>
         <w:t>Для каждого блока сначала добавлены тесты и подтвержден их провал на еще отсутствующей логике. Ошибка сборки не засчитывалась как Red: для каждого запуска проверен файл результатов TRX. Затем добавлена минимальная реализация и подтвержден Green. Последним этапом выделены вспомогательные методы без изменения поведения, после чего все тесты снова прошли.</w:t>
       </w:r>
@@ -4924,8 +5690,8 @@
       <w:r>
         <w:rPr>
           <w:rFonts w:ascii="Times New Roman" w:hAnsi="Times New Roman" w:eastAsia="Times New Roman" w:cs="Times New Roman"/>
+          <w:color w:val="000000"/>
           <w:sz w:val="28"/>
-          <w:color w:val="000000"/>
         </w:rPr>
         <w:t>Таблица 3 — Результаты циклов TDD</w:t>
       </w:r>
@@ -5436,8 +6202,8 @@
         <w:rPr>
           <w:rFonts w:ascii="Times New Roman" w:hAnsi="Times New Roman" w:eastAsia="Times New Roman" w:cs="Times New Roman"/>
           <w:b w:val="0"/>
+          <w:color w:val="000000"/>
           <w:sz w:val="28"/>
-          <w:color w:val="000000"/>
         </w:rPr>
         <w:t>Каждая стадия Red и Green сохранена отдельным коммитом. Полные журналы находятся в docs/evidence/tdd, сводка запусков — в tdd-runs.json. После Refactor успешно выполнены все 77 случаев.</w:t>
       </w:r>
@@ -5450,8 +6216,8 @@
       <w:r>
         <w:rPr>
           <w:rFonts w:ascii="Times New Roman" w:hAnsi="Times New Roman" w:eastAsia="Times New Roman" w:cs="Times New Roman"/>
+          <w:color w:val="000000"/>
           <w:sz w:val="28"/>
-          <w:color w:val="000000"/>
         </w:rPr>
         <w:t>Одиночный тест Fact и паттерн AAA</w:t>
       </w:r>
@@ -5464,8 +6230,8 @@
         <w:rPr>
           <w:rFonts w:ascii="Times New Roman" w:hAnsi="Times New Roman" w:eastAsia="Times New Roman" w:cs="Times New Roman"/>
           <w:b w:val="0"/>
+          <w:color w:val="000000"/>
           <w:sz w:val="28"/>
-          <w:color w:val="000000"/>
         </w:rPr>
         <w:t>В тесте проверяется совместное применение типа, веса, хрупкости и страховки. Arrange создает калькулятор и заявку, Act выполняет расчет, Assert проверяет точно вычисленную сумму. Ниже приведен показательный фрагмент InsuranceTests; необязательное пояснение в утверждении опущено.</w:t>
       </w:r>
@@ -5748,8 +6514,8 @@
         <w:rPr>
           <w:rFonts w:ascii="Times New Roman" w:hAnsi="Times New Roman" w:eastAsia="Times New Roman" w:cs="Times New Roman"/>
           <w:b w:val="0"/>
+          <w:color w:val="000000"/>
           <w:sz w:val="28"/>
-          <w:color w:val="000000"/>
         </w:rPr>
         <w:t>Такой тест обнаруживает ошибки порядка операций: умножение надбавки за вес на коэффициент типа или увеличение страховой суммы на 15%. Проверка только положительного результата эти ошибки не выявила бы.</w:t>
       </w:r>
@@ -5762,8 +6528,8 @@
       <w:r>
         <w:rPr>
           <w:rFonts w:ascii="Times New Roman" w:hAnsi="Times New Roman" w:eastAsia="Times New Roman" w:cs="Times New Roman"/>
+          <w:color w:val="000000"/>
           <w:sz w:val="28"/>
-          <w:color w:val="000000"/>
         </w:rPr>
         <w:t>Параметризованный тест Theory</w:t>
       </w:r>
@@ -5776,8 +6542,8 @@
         <w:rPr>
           <w:rFonts w:ascii="Times New Roman" w:hAnsi="Times New Roman" w:eastAsia="Times New Roman" w:cs="Times New Roman"/>
           <w:b w:val="0"/>
+          <w:color w:val="000000"/>
           <w:sz w:val="28"/>
-          <w:color w:val="000000"/>
         </w:rPr>
         <w:t>Граничные данные объединены в один метод, потому что подготовка заявки, вызов и утверждение одинаковы. В полном тесте также проверяются границы 100 и 1000 км. В этом листинге показаны значения ниже, на границе и выше 10 км.</w:t>
       </w:r>
@@ -6111,8 +6877,8 @@
         <w:rPr>
           <w:rFonts w:ascii="Times New Roman" w:hAnsi="Times New Roman" w:eastAsia="Times New Roman" w:cs="Times New Roman"/>
           <w:b w:val="0"/>
+          <w:color w:val="000000"/>
           <w:sz w:val="28"/>
-          <w:color w:val="000000"/>
         </w:rPr>
         <w:t>InlineData задает отдельный случай xUnit для каждой строки. Параметры преобразуются в decimal до расчета; в основном модуле расстояние и сумма представлены только этим типом.</w:t>
       </w:r>
@@ -6125,8 +6891,8 @@
       <w:r>
         <w:rPr>
           <w:rFonts w:ascii="Times New Roman" w:hAnsi="Times New Roman" w:eastAsia="Times New Roman" w:cs="Times New Roman"/>
+          <w:color w:val="000000"/>
           <w:sz w:val="28"/>
-          <w:color w:val="000000"/>
         </w:rPr>
         <w:t>Проверка исключений через FluentAssertions</w:t>
       </w:r>
@@ -6139,8 +6905,8 @@
         <w:rPr>
           <w:rFonts w:ascii="Times New Roman" w:hAnsi="Times New Roman" w:eastAsia="Times New Roman" w:cs="Times New Roman"/>
           <w:b w:val="0"/>
+          <w:color w:val="000000"/>
           <w:sz w:val="28"/>
-          <w:color w:val="000000"/>
         </w:rPr>
         <w:t>Негативные сценарии проверяют точный вид ошибки и имя некорректного параметра. Вызов помещен в делегат Action, поэтому исключение проверяется в секции Assert и не прерывает тест до утверждения.</w:t>
       </w:r>
@@ -6491,8 +7257,8 @@
         <w:rPr>
           <w:rFonts w:ascii="Times New Roman" w:hAnsi="Times New Roman" w:eastAsia="Times New Roman" w:cs="Times New Roman"/>
           <w:b w:val="0"/>
+          <w:color w:val="000000"/>
           <w:sz w:val="28"/>
-          <w:color w:val="000000"/>
         </w:rPr>
         <w:t>Аналогично проверяются вес, null и неизвестный тип доставки. Названия методов следуют схеме MethodName_Condition_ExpectedBehavior, а все тесты содержат требуемые комментарии ARRANGE, ACT и ASSERT.</w:t>
       </w:r>
@@ -6505,8 +7271,8 @@
       <w:r>
         <w:rPr>
           <w:rFonts w:ascii="Times New Roman" w:hAnsi="Times New Roman" w:eastAsia="Times New Roman" w:cs="Times New Roman"/>
+          <w:color w:val="000000"/>
           <w:sz w:val="28"/>
-          <w:color w:val="000000"/>
         </w:rPr>
         <w:t>3 Результаты измерения покрытия</w:t>
       </w:r>
@@ -6519,8 +7285,8 @@
         <w:rPr>
           <w:rFonts w:ascii="Times New Roman" w:hAnsi="Times New Roman" w:eastAsia="Times New Roman" w:cs="Times New Roman"/>
           <w:b w:val="0"/>
+          <w:color w:val="000000"/>
           <w:sz w:val="28"/>
-          <w:color w:val="000000"/>
         </w:rPr>
         <w:t>Полный запуск xUnit завершился успешно: 77 случаев, 0 провалов. Покрыты 57 из 57 строк и 32 из 32 ветвей Lab2.Core. Line Coverage = 100%, Branch Coverage = 100%; обе метрики превышают требуемые 90%.</w:t>
       </w:r>
@@ -6535,8 +7301,8 @@
       <w:r>
         <w:rPr>
           <w:rFonts w:ascii="Times New Roman" w:hAnsi="Times New Roman" w:eastAsia="Times New Roman" w:cs="Times New Roman"/>
+          <w:color w:val="000000"/>
           <w:sz w:val="28"/>
-          <w:color w:val="000000"/>
         </w:rPr>
         <w:drawing>
           <wp:inline xmlns:a="http://schemas.openxmlformats.org/drawingml/2006/main" xmlns:pic="http://schemas.openxmlformats.org/drawingml/2006/picture">
@@ -6579,8 +7345,8 @@
       <w:r>
         <w:rPr>
           <w:rFonts w:ascii="Times New Roman" w:hAnsi="Times New Roman" w:eastAsia="Times New Roman" w:cs="Times New Roman"/>
+          <w:color w:val="000000"/>
           <w:sz w:val="28"/>
-          <w:color w:val="000000"/>
         </w:rPr>
         <w:t>Рисунок 1 — Итоговый HTML отчет ReportGenerator</w:t>
       </w:r>
@@ -6593,8 +7359,8 @@
       <w:r>
         <w:rPr>
           <w:rFonts w:ascii="Times New Roman" w:hAnsi="Times New Roman" w:eastAsia="Times New Roman" w:cs="Times New Roman"/>
+          <w:color w:val="000000"/>
           <w:sz w:val="28"/>
-          <w:color w:val="000000"/>
         </w:rPr>
         <w:t>Промежуточный анализ покрытия</w:t>
       </w:r>
@@ -6607,8 +7373,8 @@
         <w:rPr>
           <w:rFonts w:ascii="Times New Roman" w:hAnsi="Times New Roman" w:eastAsia="Times New Roman" w:cs="Times New Roman"/>
           <w:b w:val="0"/>
+          <w:color w:val="000000"/>
           <w:sz w:val="28"/>
-          <w:color w:val="000000"/>
         </w:rPr>
         <w:t>После реализации тарифов выполнен отдельный промежуточный запуск только ValidationTests. Он показывает, почему одной группы валидации недостаточно. Сравниваются разные этапы и наборы тестов; в финальном коде дополнительно реализованы страховка, предел цены и рефакторинг.</w:t>
       </w:r>
@@ -6621,8 +7387,8 @@
       <w:r>
         <w:rPr>
           <w:rFonts w:ascii="Times New Roman" w:hAnsi="Times New Roman" w:eastAsia="Times New Roman" w:cs="Times New Roman"/>
+          <w:color w:val="000000"/>
           <w:sz w:val="28"/>
-          <w:color w:val="000000"/>
         </w:rPr>
         <w:t>Таблица 4 — Промежуточное и итоговое покрытие</w:t>
       </w:r>
@@ -6881,8 +7647,8 @@
       <w:r>
         <w:rPr>
           <w:rFonts w:ascii="Times New Roman" w:hAnsi="Times New Roman" w:eastAsia="Times New Roman" w:cs="Times New Roman"/>
+          <w:color w:val="000000"/>
           <w:sz w:val="28"/>
-          <w:color w:val="000000"/>
         </w:rPr>
         <w:drawing>
           <wp:inline xmlns:a="http://schemas.openxmlformats.org/drawingml/2006/main" xmlns:pic="http://schemas.openxmlformats.org/drawingml/2006/picture">
@@ -6925,8 +7691,8 @@
       <w:r>
         <w:rPr>
           <w:rFonts w:ascii="Times New Roman" w:hAnsi="Times New Roman" w:eastAsia="Times New Roman" w:cs="Times New Roman"/>
+          <w:color w:val="000000"/>
           <w:sz w:val="28"/>
-          <w:color w:val="000000"/>
         </w:rPr>
         <w:t>Рисунок 2 — Непокрытые тарифные ветви промежуточного запуска</w:t>
       </w:r>
@@ -6939,8 +7705,8 @@
         <w:rPr>
           <w:rFonts w:ascii="Times New Roman" w:hAnsi="Times New Roman" w:eastAsia="Times New Roman" w:cs="Times New Roman"/>
           <w:b w:val="0"/>
+          <w:color w:val="000000"/>
           <w:sz w:val="28"/>
-          <w:color w:val="000000"/>
         </w:rPr>
         <w:t>На рисунке красным выделены расчеты средних диапазонов расстояния, желтым — частично покрытые условия. Их проверяют случаи 10,01–100 км и 100,01–1000 км из TariffTests. В полном наборе включены все весовые диапазоны, Express, Overnight и хрупкость; затем по TDD добавлены страховка и ограничение цены.</w:t>
       </w:r>
@@ -6953,8 +7719,8 @@
       <w:r>
         <w:rPr>
           <w:rFonts w:ascii="Times New Roman" w:hAnsi="Times New Roman" w:eastAsia="Times New Roman" w:cs="Times New Roman"/>
+          <w:color w:val="000000"/>
           <w:sz w:val="28"/>
-          <w:color w:val="000000"/>
         </w:rPr>
         <w:t>Команды и воспроизводимость результатов</w:t>
       </w:r>
@@ -6967,8 +7733,8 @@
         <w:rPr>
           <w:rFonts w:ascii="Times New Roman" w:hAnsi="Times New Roman" w:eastAsia="Times New Roman" w:cs="Times New Roman"/>
           <w:b w:val="0"/>
+          <w:color w:val="000000"/>
           <w:sz w:val="28"/>
-          <w:color w:val="000000"/>
         </w:rPr>
         <w:t>Основной способ измерения покрытия соответствует шагу 4 методички. Из корня репозитория выполняются следующие команды. Для HTML отчета берется файл Cobertura, созданный именно текущим запуском.</w:t>
       </w:r>
@@ -7083,8 +7849,8 @@
         <w:rPr>
           <w:rFonts w:ascii="Times New Roman" w:hAnsi="Times New Roman" w:eastAsia="Times New Roman" w:cs="Times New Roman"/>
           <w:b w:val="0"/>
+          <w:color w:val="000000"/>
           <w:sz w:val="28"/>
-          <w:color w:val="000000"/>
         </w:rPr>
         <w:t>Coverlet измеряет всю сборку Lab2.Core без исключения строк или методов бизнес логики. Тестовая сборка не включается. Готовый HTML отчет находится в docs/coverage/final/index.html; XML измерений — в docs/evidence/coverage-final.cobertura.xml, результаты тестов — в final.trx. Для повторного запуска и проверки порога 90% предусмотрен scripts/Test-WithCoverage.ps1.</w:t>
       </w:r>
@@ -7097,8 +7863,8 @@
         <w:rPr>
           <w:rFonts w:ascii="Times New Roman" w:hAnsi="Times New Roman" w:eastAsia="Times New Roman" w:cs="Times New Roman"/>
           <w:b w:val="0"/>
+          <w:color w:val="000000"/>
           <w:sz w:val="28"/>
-          <w:color w:val="000000"/>
         </w:rPr>
         <w:t>Дополнительно проверен альтернативный способ coverlet.msbuild. Он запускает те же тесты и контролирует пороги покрытия строк и ветвей через параметры Threshold=90 и ThresholdType=line,branch. В финальном HTML отчете непокрытых строк и ветвей нет; дописывание тестов для достижения 90% не требуется.</w:t>
       </w:r>
@@ -7111,8 +7877,8 @@
       <w:r>
         <w:rPr>
           <w:rFonts w:ascii="Times New Roman" w:hAnsi="Times New Roman" w:eastAsia="Times New Roman" w:cs="Times New Roman"/>
+          <w:color w:val="000000"/>
           <w:sz w:val="28"/>
-          <w:color w:val="000000"/>
         </w:rPr>
         <w:t>4 Анализ качества тестов</w:t>
       </w:r>
@@ -7125,8 +7891,8 @@
         <w:rPr>
           <w:rFonts w:ascii="Times New Roman" w:hAnsi="Times New Roman" w:eastAsia="Times New Roman" w:cs="Times New Roman"/>
           <w:b w:val="0"/>
+          <w:color w:val="000000"/>
           <w:sz w:val="28"/>
-          <w:color w:val="000000"/>
         </w:rPr>
         <w:t>Выявлены границы диапазонов 0 и 5000 км, 0 и 1000 кг, тарифные пороги 10, 100, 1000 км и 5, 20, 100 кг, объявленная стоимость 0 и 5000 руб., итоговая цена 50000 руб. Проверены значения ниже, на границе и выше, чтобы выявить ошибки &lt; и ≤.</w:t>
       </w:r>
@@ -7139,8 +7905,8 @@
         <w:rPr>
           <w:rFonts w:ascii="Times New Roman" w:hAnsi="Times New Roman" w:eastAsia="Times New Roman" w:cs="Times New Roman"/>
           <w:b w:val="0"/>
+          <w:color w:val="000000"/>
           <w:sz w:val="28"/>
-          <w:color w:val="000000"/>
         </w:rPr>
         <w:t>Параметризация объединяет одинаковые проверки расстояния, веса, типа, хрупкости, страховки и предела. Каждый набор данных имеет отдельный результат. Fact используются для совместного расчета, null, максимальной объявленной стоимости и повторяемости.</w:t>
       </w:r>
@@ -7153,8 +7919,8 @@
         <w:rPr>
           <w:rFonts w:ascii="Times New Roman" w:hAnsi="Times New Roman" w:eastAsia="Times New Roman" w:cs="Times New Roman"/>
           <w:b w:val="0"/>
+          <w:color w:val="000000"/>
           <w:sz w:val="28"/>
-          <w:color w:val="000000"/>
         </w:rPr>
         <w:t>Сложные условия с коротким замыканием покрыты всеми допустимыми исходами. Для страховки проверены четыре сочетания IsInsured и DeclaredValue &gt; 0. Для валидации — отрицательные, нулевые, допустимые и превышающие максимум значения. Предел проверен после тарифа, типа, хрупкости и страховки.</w:t>
       </w:r>
@@ -7167,8 +7933,8 @@
         <w:rPr>
           <w:rFonts w:ascii="Times New Roman" w:hAnsi="Times New Roman" w:eastAsia="Times New Roman" w:cs="Times New Roman"/>
           <w:b w:val="0"/>
+          <w:color w:val="000000"/>
           <w:sz w:val="28"/>
-          <w:color w:val="000000"/>
         </w:rPr>
         <w:t>Соблюдены FIRST: тесты быстрые, изолированные, повторяемые и самопроверяемые; они написаны до реализации. Используются независимые заявки, постоянные данные и утверждения FluentAssertions. Повторный расчет сохраняет вход и дает одинаковую сумму.</w:t>
       </w:r>
@@ -7181,8 +7947,8 @@
         <w:rPr>
           <w:rFonts w:ascii="Times New Roman" w:hAnsi="Times New Roman" w:eastAsia="Times New Roman" w:cs="Times New Roman"/>
           <w:b w:val="0"/>
+          <w:color w:val="000000"/>
           <w:sz w:val="28"/>
-          <w:color w:val="000000"/>
         </w:rPr>
         <w:t>100% покрытия строк и ветвей не доказывают отсутствие всех дефектов и не равны полному покрытию путей. Качество дополнительно поддерживают точные ожидаемые суммы, негативные случаи, границы и проверки порядка надбавок.</w:t>
       </w:r>
@@ -7194,8 +7960,8 @@
       <w:r>
         <w:rPr>
           <w:rFonts w:ascii="Times New Roman" w:hAnsi="Times New Roman" w:eastAsia="Times New Roman" w:cs="Times New Roman"/>
+          <w:color w:val="000000"/>
           <w:sz w:val="28"/>
-          <w:color w:val="000000"/>
         </w:rPr>
         <w:t>Заключение</w:t>
       </w:r>
@@ -7208,8 +7974,8 @@
         <w:rPr>
           <w:rFonts w:ascii="Times New Roman" w:hAnsi="Times New Roman" w:eastAsia="Times New Roman" w:cs="Times New Roman"/>
           <w:b w:val="0"/>
+          <w:color w:val="000000"/>
           <w:sz w:val="28"/>
-          <w:color w:val="000000"/>
         </w:rPr>
         <w:t>Разработан модуль службы доставки по TDD с последующим рефакторингом. Созданы два проекта, матрица из 36 сценариев, 77 тестовых случаев и HTML отчет. Все тесты проходят. Line Coverage — 100% (57/57), Branch Coverage — 100% (32/32); порог 90% достигнут.</w:t>
       </w:r>

</xml_diff>